<commit_message>
Finaliza calendario WhatsApp de julho com textos de chamada e pendencia de termo de comunidade
Adiciona texto de chamada especifico (puxando do proprio conteudo do
post) nos reposts de 29/07 e 31/07, e observacao pendente para definir
com a Camila um termo pra chamar as pessoas do grupo em agosto
(por enquanto usa "mulheres").

Co-Authored-By: Claude Sonnet 5 <noreply@anthropic.com>
</commit_message>
<xml_diff>
--- a/camila-sartori/calendario-fonte/calendario-whatsapp-julho.docx
+++ b/camila-sartori/calendario-fonte/calendario-whatsapp-julho.docx
@@ -200,7 +200,7 @@
                 <w:i w:val="0"/>
                 <w:sz w:val="19"/>
               </w:rPr>
-              <w:t>Oi, que bom ter você aqui. Meu nome é Camila, sou psicóloga há quase dez anos, mestre em Psicologia Clínica e atualmente doutoranda. Criei esse espaço, esse grupo VIP, para tratar com vocês de maneira mais próxima, com alguns conteúdos exclusivos, e outras vezes com explicações sobre o que sai no Instagram, sobre autoconhecimento, autoestima e relacionamentos. Do mesmo jeito que eu trabalho na minha prática individual, como psicóloga, só que aqui em um contexto de grupo. Por isso, vou trazer sempre percepções mais gerais, já que aqui tem várias pessoas, em vários momentos, com várias trajetórias diferentes. Deixando claro que esse grupo não substitui um atendimento psicológico individual e personalizado. Aqui eu vou trazer reflexões, técnicas, bastidores, PDFs, ebooks e muitos outros materiais que eu não posto em nenhum outro lugar. Fico muito feliz que você tenha se permitido começar, ou aprofundar, a sua jornada de autoconhecimento comigo, e por ter me dado essa oportunidade de te ajudar. Contem comigo, para que a gente possa interagir bastante por aqui. Nos próximos dias vocês já vão ver alguns conteúdos bem interessantes por aqui, e vamos conversando.</w:t>
+              <w:t>Oi, que bom ter você aqui. Meu nome é Camila, sou psicóloga há quase dez anos, mestre em Psicologia Clínica e atualmente doutoranda. Criei esse espaço, esse grupo VIP, para compartilhar com vocês de maneira mais próxima, alguns conteúdos exclusivos, sobre autoconhecimento, autoestima e relacionamentos. Do mesmo jeito que eu trabalho na minha prática individual, como psicóloga, só que aqui em um contexto de grupo. Por isso, vou trazer sempre percepções mais gerais, já que aqui temos várias pessoas, em vários momentos, com várias trajetórias diferentes. Deixando claro que esse grupo não substitui um atendimento psicológico individual e personalizado. Aqui eu vou trazer reflexões, técnicas, bastidores, materiais de estudo que eu não posto em nenhum outro lugar. Fico muito feliz que você tenha se permitido começar, ou se aprofundar na sua jornada de autoconhecimento. Contem comigo! Nos próximos dias vocês já vão ver alguns conteúdos bem interessantes por aqui, um ótimo dia!</w:t>
             </w:r>
           </w:p>
           <w:p>
@@ -395,13 +395,13 @@
                 <w:i w:val="0"/>
                 <w:sz w:val="19"/>
               </w:rPr>
-              <w:t>TEXTO DE REFLEXÃO (enviar primeiro): Bom dia! Uma pergunta simples para começar a semana: quando foi a última vez que você fez alguma coisa só porque queria, sem pensar primeiro no que os outros iam achar?</w:t>
+              <w:t>TEXTO DE REFLEXÃO (enviar primeiro): "Bom dia / Boa tarde / Boa noite! Uma pergunta simples para começar a semana: quando foi a última vez que você fez alguma coisa só porque queria, sem pensar primeiro no que os outros iam achar?"</w:t>
               <w:br/>
               <w:br/>
-              <w:t>Além disso, para eu direcionar cada vez mais conteúdos que façam mais sentido para vocês, responde a essa enquete:</w:t>
+              <w:t>Em seguida: "Além disso, para eu conhecê-las melhor e assim, direcionar conteúdos que façam mais sentido para vocês, responde a essa enquete:"</w:t>
               <w:br/>
               <w:br/>
-              <w:t>ENQUETE: "Você entrou nesse grupo por quê? Me conta para eu te conhecer melhor e direcionar melhor o conteúdo aqui:"</w:t>
+              <w:t>ENQUETE: "Você entrou nesse grupo por qual motivo?"</w:t>
               <w:br/>
               <w:t>Opções: Quero trabalhar minha autoestima / Quero entender melhor meus relacionamentos / Quero aprender mais sobre autoconhecimento / Tenho curiosidade sobre terapia do esquema e TCC / Só quero acompanhar o conteúdo.</w:t>
             </w:r>
@@ -541,7 +541,10 @@
                 <w:i w:val="0"/>
                 <w:sz w:val="19"/>
               </w:rPr>
-              <w:t>Repost do post estático de 29/07: "Toda vez que você diz sim para todo mundo, talvez esteja dizendo não para você mesma..." (legenda completa igual ao Instagram).</w:t>
+              <w:t>TEXTO DE CHAMADA: "Mulheres, vocês já se pegaram respondendo sim quando na verdade queriam dizer não? Pois é, quanto mais a gente faz isso, mais acaba se anulando, se invalidando. Eu me aprofundo nessa temática no post de hoje, no link abaixo 👇🏻"</w:t>
+              <w:br/>
+              <w:br/>
+              <w:t>Em seguida, repostar o post estático de 29/07: "Toda vez que você diz sim para todo mundo, talvez esteja dizendo não para você mesma..." (mesma arte e legenda do Instagram).</w:t>
             </w:r>
           </w:p>
         </w:tc>
@@ -679,7 +682,33 @@
                 <w:i w:val="0"/>
                 <w:sz w:val="19"/>
               </w:rPr>
-              <w:t>Repost do reel de 31/07: "Você já reparou que, quando um relacionamento começa a dar certo de verdade..." (legenda completa igual ao Instagram).</w:t>
+              <w:t>TEXTO DE CHAMADA: "Mulheres, vocês já repararam que, quando um relacionamento começa a dar certo de verdade, uma parte de vocês fica desconfiada? Pois é, isso também pode ser uma crença limitante. Eu me aprofundo nessa temática no post de hoje, no link abaixo 👇🏻"</w:t>
+              <w:br/>
+              <w:br/>
+              <w:t>Em seguida, repostar o reel de 31/07: "Você já reparou que, quando um relacionamento começa a dar certo de verdade..." (mesmo vídeo e legenda do Instagram).</w:t>
+            </w:r>
+          </w:p>
+          <w:p>
+            <w:pPr>
+              <w:spacing w:after="100"/>
+            </w:pPr>
+            <w:r>
+              <w:rPr>
+                <w:b/>
+                <w:i/>
+                <w:color w:val="9C1256"/>
+                <w:sz w:val="17"/>
+              </w:rPr>
+              <w:t xml:space="preserve">📌  Observação: </w:t>
+            </w:r>
+            <w:r>
+              <w:rPr>
+                <w:b w:val="0"/>
+                <w:i/>
+                <w:color w:val="9C1256"/>
+                <w:sz w:val="17"/>
+              </w:rPr>
+              <w:t>PENDENTE PARA AGOSTO: definir com a Camila um termo específico para chamar as pessoas do grupo (testadas e recusadas: Jornadeiras, Tribo AME-SE, Time AME-SE, Amêsianas). Por enquanto, usar apenas "mulheres"/"mulher".</w:t>
             </w:r>
           </w:p>
         </w:tc>

</xml_diff>

<commit_message>
Reestrutura calendario WhatsApp em acoes numeradas, corrige rotulos
Adiciona suporte a lista de "acoes" numeradas no motor de renderizacao
(pro post_card), pra separar claramente os passos que a Camila precisa
seguir (mensagem de reflexao / pergunta / enquete; texto de chamada /
repost), em vez de um bloco unico de "legenda". Corrige o rotulo do
conteudo de 24/07 pra "ROTEIRO DE VIDEO" (nao e legenda, e um video).
Reduz fonte do titulo do documento pra nao quebrar linha de forma
estranha.

Co-Authored-By: Claude Sonnet 5 <noreply@anthropic.com>
</commit_message>
<xml_diff>
--- a/camila-sartori/calendario-fonte/calendario-whatsapp-julho.docx
+++ b/camila-sartori/calendario-fonte/calendario-whatsapp-julho.docx
@@ -11,9 +11,9 @@
           <w:b/>
           <w:i w:val="0"/>
           <w:color w:val="5A1042"/>
-          <w:sz w:val="40"/>
+          <w:sz w:val="30"/>
         </w:rPr>
-        <w:t>JULHO 2026 - Grupo de WhatsApp (últimas 2 semanas)</w:t>
+        <w:t>Grupo de WhatsApp - Julho 2026 (últimas 2 semanas)</w:t>
       </w:r>
     </w:p>
     <w:tbl>
@@ -192,7 +192,7 @@
                 <w:i w:val="0"/>
                 <w:sz w:val="19"/>
               </w:rPr>
-              <w:t xml:space="preserve">LEGENDA: </w:t>
+              <w:t xml:space="preserve">ROTEIRO DE VÍDEO: </w:t>
             </w:r>
             <w:r>
               <w:rPr>
@@ -291,7 +291,7 @@
                 <w:color w:val="FFFFFF"/>
                 <w:sz w:val="21"/>
               </w:rPr>
-              <w:t>📅  27/07 (SEG), Reflexão + enquete</w:t>
+              <w:t>📅  27/07 (SEG), Reflexão + enquete — texto pronto para copiar e colar no grupo</w:t>
             </w:r>
           </w:p>
         </w:tc>
@@ -374,20 +374,31 @@
                 <w:i w:val="0"/>
                 <w:sz w:val="18"/>
               </w:rPr>
-              <w:t>Mensagem de texto + Enquete do WhatsApp</w:t>
+              <w:t>Mensagem de texto + Enquete do WhatsApp (3 ações, enviar nessa ordem)</w:t>
             </w:r>
           </w:p>
           <w:p>
             <w:pPr>
-              <w:spacing w:after="100"/>
+              <w:spacing w:after="160" w:before="40"/>
+              <w:shd w:val="clear" w:fill="FBEEF7"/>
+              <w:pBdr>
+                <w:top w:val="single" w:sz="6" w:space="4" w:color="D9D9D9"/>
+                <w:left w:val="single" w:sz="6" w:space="4" w:color="D9D9D9"/>
+                <w:bottom w:val="single" w:sz="6" w:space="4" w:color="D9D9D9"/>
+                <w:right w:val="single" w:sz="6" w:space="4" w:color="D9D9D9"/>
+              </w:pBdr>
             </w:pPr>
             <w:r>
               <w:rPr>
                 <w:b/>
                 <w:i w:val="0"/>
-                <w:sz w:val="19"/>
+                <w:color w:val="9C1256"/>
+                <w:sz w:val="18"/>
               </w:rPr>
-              <w:t xml:space="preserve">LEGENDA: </w:t>
+              <w:t>AÇÃO 1 — Mensagem de reflexão</w:t>
+            </w:r>
+            <w:r>
+              <w:br/>
             </w:r>
             <w:r>
               <w:rPr>
@@ -395,13 +406,71 @@
                 <w:i w:val="0"/>
                 <w:sz w:val="19"/>
               </w:rPr>
-              <w:t>TEXTO DE REFLEXÃO (enviar primeiro): "Bom dia / Boa tarde / Boa noite! Uma pergunta simples para começar a semana: quando foi a última vez que você fez alguma coisa só porque queria, sem pensar primeiro no que os outros iam achar?"</w:t>
+              <w:t>Bom dia / Boa tarde / Boa noite! Uma pergunta simples para começar a semana: quando foi a última vez que você fez alguma coisa só porque queria, sem pensar primeiro no que os outros iam achar?</w:t>
+            </w:r>
+          </w:p>
+          <w:p>
+            <w:pPr>
+              <w:spacing w:after="160" w:before="40"/>
+              <w:shd w:val="clear" w:fill="FBEEF7"/>
+              <w:pBdr>
+                <w:top w:val="single" w:sz="6" w:space="4" w:color="D9D9D9"/>
+                <w:left w:val="single" w:sz="6" w:space="4" w:color="D9D9D9"/>
+                <w:bottom w:val="single" w:sz="6" w:space="4" w:color="D9D9D9"/>
+                <w:right w:val="single" w:sz="6" w:space="4" w:color="D9D9D9"/>
+              </w:pBdr>
+            </w:pPr>
+            <w:r>
+              <w:rPr>
+                <w:b/>
+                <w:i w:val="0"/>
+                <w:color w:val="9C1256"/>
+                <w:sz w:val="18"/>
+              </w:rPr>
+              <w:t>AÇÃO 2 — Pergunta de transição</w:t>
+            </w:r>
+            <w:r>
               <w:br/>
+            </w:r>
+            <w:r>
+              <w:rPr>
+                <w:b w:val="0"/>
+                <w:i w:val="0"/>
+                <w:sz w:val="19"/>
+              </w:rPr>
+              <w:t>Além disso, para eu conhecê-las melhor e assim, direcionar conteúdos que façam mais sentido para vocês, responde a essa enquete:</w:t>
+            </w:r>
+          </w:p>
+          <w:p>
+            <w:pPr>
+              <w:spacing w:after="160" w:before="40"/>
+              <w:shd w:val="clear" w:fill="FBEEF7"/>
+              <w:pBdr>
+                <w:top w:val="single" w:sz="6" w:space="4" w:color="D9D9D9"/>
+                <w:left w:val="single" w:sz="6" w:space="4" w:color="D9D9D9"/>
+                <w:bottom w:val="single" w:sz="6" w:space="4" w:color="D9D9D9"/>
+                <w:right w:val="single" w:sz="6" w:space="4" w:color="D9D9D9"/>
+              </w:pBdr>
+            </w:pPr>
+            <w:r>
+              <w:rPr>
+                <w:b/>
+                <w:i w:val="0"/>
+                <w:color w:val="9C1256"/>
+                <w:sz w:val="18"/>
+              </w:rPr>
+              <w:t>AÇÃO 3 — Enquete</w:t>
+            </w:r>
+            <w:r>
               <w:br/>
-              <w:t>Em seguida: "Além disso, para eu conhecê-las melhor e assim, direcionar conteúdos que façam mais sentido para vocês, responde a essa enquete:"</w:t>
-              <w:br/>
-              <w:br/>
-              <w:t>ENQUETE: "Você entrou nesse grupo por qual motivo?"</w:t>
+            </w:r>
+            <w:r>
+              <w:rPr>
+                <w:b w:val="0"/>
+                <w:i w:val="0"/>
+                <w:sz w:val="19"/>
+              </w:rPr>
+              <w:t>"Você entrou nesse grupo por qual motivo?"</w:t>
               <w:br/>
               <w:t>Opções: Quero trabalhar minha autoestima / Quero entender melhor meus relacionamentos / Quero aprender mais sobre autoconhecimento / Tenho curiosidade sobre terapia do esquema e TCC / Só quero acompanhar o conteúdo.</w:t>
             </w:r>
@@ -437,7 +506,7 @@
                 <w:color w:val="FFFFFF"/>
                 <w:sz w:val="21"/>
               </w:rPr>
-              <w:t>📅  29/07 (QUA), Repost</w:t>
+              <w:t>📅  29/07 (QUA), Repost — texto pronto para copiar e colar no grupo</w:t>
             </w:r>
           </w:p>
         </w:tc>
@@ -520,20 +589,31 @@
                 <w:i w:val="0"/>
                 <w:sz w:val="18"/>
               </w:rPr>
-              <w:t>Repost (mesma arte e legenda do Instagram de 29/07)</w:t>
+              <w:t>Texto de chamada + Repost (2 ações, enviar nessa ordem)</w:t>
             </w:r>
           </w:p>
           <w:p>
             <w:pPr>
-              <w:spacing w:after="100"/>
+              <w:spacing w:after="160" w:before="40"/>
+              <w:shd w:val="clear" w:fill="FBEEF7"/>
+              <w:pBdr>
+                <w:top w:val="single" w:sz="6" w:space="4" w:color="D9D9D9"/>
+                <w:left w:val="single" w:sz="6" w:space="4" w:color="D9D9D9"/>
+                <w:bottom w:val="single" w:sz="6" w:space="4" w:color="D9D9D9"/>
+                <w:right w:val="single" w:sz="6" w:space="4" w:color="D9D9D9"/>
+              </w:pBdr>
             </w:pPr>
             <w:r>
               <w:rPr>
                 <w:b/>
                 <w:i w:val="0"/>
-                <w:sz w:val="19"/>
+                <w:color w:val="9C1256"/>
+                <w:sz w:val="18"/>
               </w:rPr>
-              <w:t xml:space="preserve">LEGENDA: </w:t>
+              <w:t>AÇÃO 1 — Texto de chamada (enviar antes do repost)</w:t>
+            </w:r>
+            <w:r>
+              <w:br/>
             </w:r>
             <w:r>
               <w:rPr>
@@ -541,10 +621,39 @@
                 <w:i w:val="0"/>
                 <w:sz w:val="19"/>
               </w:rPr>
-              <w:t>TEXTO DE CHAMADA: "Mulheres, vocês já se pegaram respondendo sim quando na verdade queriam dizer não? Pois é, quanto mais a gente faz isso, mais acaba se anulando, se invalidando. Eu me aprofundo nessa temática no post de hoje, no link abaixo 👇🏻"</w:t>
+              <w:t>Mulheres, vocês já se pegaram respondendo sim quando na verdade queriam dizer não? Pois é, quanto mais a gente faz isso, mais acaba se anulando, se invalidando. Eu me aprofundo nessa temática no post de hoje, no link abaixo 👇🏻</w:t>
+            </w:r>
+          </w:p>
+          <w:p>
+            <w:pPr>
+              <w:spacing w:after="160" w:before="40"/>
+              <w:shd w:val="clear" w:fill="FBEEF7"/>
+              <w:pBdr>
+                <w:top w:val="single" w:sz="6" w:space="4" w:color="D9D9D9"/>
+                <w:left w:val="single" w:sz="6" w:space="4" w:color="D9D9D9"/>
+                <w:bottom w:val="single" w:sz="6" w:space="4" w:color="D9D9D9"/>
+                <w:right w:val="single" w:sz="6" w:space="4" w:color="D9D9D9"/>
+              </w:pBdr>
+            </w:pPr>
+            <w:r>
+              <w:rPr>
+                <w:b/>
+                <w:i w:val="0"/>
+                <w:color w:val="9C1256"/>
+                <w:sz w:val="18"/>
+              </w:rPr>
+              <w:t>AÇÃO 2 — Repost do Instagram</w:t>
+            </w:r>
+            <w:r>
               <w:br/>
-              <w:br/>
-              <w:t>Em seguida, repostar o post estático de 29/07: "Toda vez que você diz sim para todo mundo, talvez esteja dizendo não para você mesma..." (mesma arte e legenda do Instagram).</w:t>
+            </w:r>
+            <w:r>
+              <w:rPr>
+                <w:b w:val="0"/>
+                <w:i w:val="0"/>
+                <w:sz w:val="19"/>
+              </w:rPr>
+              <w:t>Repostar o post estático de 29/07, com a mesma arte e legenda do Instagram: "Toda vez que você diz sim para todo mundo, talvez esteja dizendo não para você mesma..."</w:t>
             </w:r>
           </w:p>
         </w:tc>
@@ -578,7 +687,7 @@
                 <w:color w:val="FFFFFF"/>
                 <w:sz w:val="21"/>
               </w:rPr>
-              <w:t>📅  31/07 (SEX), Repost</w:t>
+              <w:t>📅  31/07 (SEX), Repost — texto pronto para copiar e colar no grupo</w:t>
             </w:r>
           </w:p>
         </w:tc>
@@ -661,20 +770,31 @@
                 <w:i w:val="0"/>
                 <w:sz w:val="18"/>
               </w:rPr>
-              <w:t>Repost (mesmo vídeo e legenda do Instagram de 31/07)</w:t>
+              <w:t>Texto de chamada + Repost (2 ações, enviar nessa ordem)</w:t>
             </w:r>
           </w:p>
           <w:p>
             <w:pPr>
-              <w:spacing w:after="100"/>
+              <w:spacing w:after="160" w:before="40"/>
+              <w:shd w:val="clear" w:fill="FBEEF7"/>
+              <w:pBdr>
+                <w:top w:val="single" w:sz="6" w:space="4" w:color="D9D9D9"/>
+                <w:left w:val="single" w:sz="6" w:space="4" w:color="D9D9D9"/>
+                <w:bottom w:val="single" w:sz="6" w:space="4" w:color="D9D9D9"/>
+                <w:right w:val="single" w:sz="6" w:space="4" w:color="D9D9D9"/>
+              </w:pBdr>
             </w:pPr>
             <w:r>
               <w:rPr>
                 <w:b/>
                 <w:i w:val="0"/>
-                <w:sz w:val="19"/>
+                <w:color w:val="9C1256"/>
+                <w:sz w:val="18"/>
               </w:rPr>
-              <w:t xml:space="preserve">LEGENDA: </w:t>
+              <w:t>AÇÃO 1 — Texto de chamada (enviar antes do repost)</w:t>
+            </w:r>
+            <w:r>
+              <w:br/>
             </w:r>
             <w:r>
               <w:rPr>
@@ -682,10 +802,39 @@
                 <w:i w:val="0"/>
                 <w:sz w:val="19"/>
               </w:rPr>
-              <w:t>TEXTO DE CHAMADA: "Mulheres, vocês já repararam que, quando um relacionamento começa a dar certo de verdade, uma parte de vocês fica desconfiada? Pois é, isso também pode ser uma crença limitante. Eu me aprofundo nessa temática no post de hoje, no link abaixo 👇🏻"</w:t>
+              <w:t>Mulheres, vocês já repararam que, quando um relacionamento começa a dar certo de verdade, uma parte de vocês fica desconfiada? Pois é, isso também pode ser uma crença limitante. Eu me aprofundo nessa temática no post de hoje, no link abaixo 👇🏻</w:t>
+            </w:r>
+          </w:p>
+          <w:p>
+            <w:pPr>
+              <w:spacing w:after="160" w:before="40"/>
+              <w:shd w:val="clear" w:fill="FBEEF7"/>
+              <w:pBdr>
+                <w:top w:val="single" w:sz="6" w:space="4" w:color="D9D9D9"/>
+                <w:left w:val="single" w:sz="6" w:space="4" w:color="D9D9D9"/>
+                <w:bottom w:val="single" w:sz="6" w:space="4" w:color="D9D9D9"/>
+                <w:right w:val="single" w:sz="6" w:space="4" w:color="D9D9D9"/>
+              </w:pBdr>
+            </w:pPr>
+            <w:r>
+              <w:rPr>
+                <w:b/>
+                <w:i w:val="0"/>
+                <w:color w:val="9C1256"/>
+                <w:sz w:val="18"/>
+              </w:rPr>
+              <w:t>AÇÃO 2 — Repost do Instagram</w:t>
+            </w:r>
+            <w:r>
               <w:br/>
-              <w:br/>
-              <w:t>Em seguida, repostar o reel de 31/07: "Você já reparou que, quando um relacionamento começa a dar certo de verdade..." (mesmo vídeo e legenda do Instagram).</w:t>
+            </w:r>
+            <w:r>
+              <w:rPr>
+                <w:b w:val="0"/>
+                <w:i w:val="0"/>
+                <w:sz w:val="19"/>
+              </w:rPr>
+              <w:t>Repostar o reel de 31/07, com o mesmo vídeo e legenda do Instagram: "Você já reparou que, quando um relacionamento começa a dar certo de verdade..."</w:t>
             </w:r>
           </w:p>
           <w:p>

</xml_diff>